<commit_message>
Changed Everything - Now it's my style
</commit_message>
<xml_diff>
--- a/resume/nonCoopResume.docx
+++ b/resume/nonCoopResume.docx
@@ -56,8 +56,6 @@
         </w:rPr>
         <w:t>Computer Engineer</w:t>
       </w:r>
-      <w:bookmarkStart w:id="0" w:name="_GoBack"/>
-      <w:bookmarkEnd w:id="0"/>
       <w:r>
         <w:rPr>
           <w:rFonts w:ascii="Arial" w:hAnsi="Arial" w:cs="Arial"/>
@@ -157,6 +155,20 @@
           <w:color w:val="222222"/>
           <w:shd w:val="clear" w:color="auto" w:fill="FFFFFF"/>
         </w:rPr>
+        <w:t xml:space="preserve"> • </w:t>
+      </w:r>
+      <w:r>
+        <w:rPr>
+          <w:rFonts w:ascii="Arial" w:hAnsi="Arial" w:cs="Arial"/>
+          <w:sz w:val="20"/>
+        </w:rPr>
+        <w:t>www.marshallelford.com</w:t>
+      </w:r>
+      <w:r>
+        <w:rPr>
+          <w:rFonts w:ascii="Arial" w:hAnsi="Arial" w:cs="Arial"/>
+          <w:sz w:val="20"/>
+        </w:rPr>
         <w:t xml:space="preserve"> </w:t>
       </w:r>
       <w:r>
@@ -165,45 +177,7 @@
           <w:color w:val="222222"/>
           <w:shd w:val="clear" w:color="auto" w:fill="FFFFFF"/>
         </w:rPr>
-        <w:t>•</w:t>
-      </w:r>
-      <w:r>
-        <w:rPr>
-          <w:rFonts w:ascii="Arial" w:hAnsi="Arial" w:cs="Arial"/>
-          <w:color w:val="222222"/>
-          <w:shd w:val="clear" w:color="auto" w:fill="FFFFFF"/>
-        </w:rPr>
-        <w:t xml:space="preserve"> </w:t>
-      </w:r>
-      <w:r>
-        <w:rPr>
-          <w:rFonts w:ascii="Arial" w:hAnsi="Arial" w:cs="Arial"/>
-          <w:sz w:val="20"/>
-        </w:rPr>
-        <w:t>www.marshallelford.com</w:t>
-      </w:r>
-      <w:r>
-        <w:rPr>
-          <w:rFonts w:ascii="Arial" w:hAnsi="Arial" w:cs="Arial"/>
-          <w:sz w:val="20"/>
-        </w:rPr>
-        <w:t xml:space="preserve"> </w:t>
-      </w:r>
-      <w:r>
-        <w:rPr>
-          <w:rFonts w:ascii="Arial" w:hAnsi="Arial" w:cs="Arial"/>
-          <w:color w:val="222222"/>
-          <w:shd w:val="clear" w:color="auto" w:fill="FFFFFF"/>
-        </w:rPr>
-        <w:t>•</w:t>
-      </w:r>
-      <w:r>
-        <w:rPr>
-          <w:rFonts w:ascii="Arial" w:hAnsi="Arial" w:cs="Arial"/>
-          <w:color w:val="222222"/>
-          <w:shd w:val="clear" w:color="auto" w:fill="FFFFFF"/>
-        </w:rPr>
-        <w:t xml:space="preserve"> </w:t>
+        <w:t xml:space="preserve">• </w:t>
       </w:r>
       <w:r>
         <w:rPr>
@@ -324,7 +298,7 @@
                 <w:b/>
                 <w:sz w:val="18"/>
               </w:rPr>
-              <w:t>Computer</w:t>
+              <w:t>Languages</w:t>
             </w:r>
           </w:p>
         </w:tc>
@@ -360,7 +334,7 @@
                     <w:b/>
                     <w:sz w:val="18"/>
                   </w:rPr>
-                  <w:t>Communication</w:t>
+                  <w:t>Tools</w:t>
                 </w:r>
               </w:p>
             </w:sdtContent>
@@ -451,7 +425,7 @@
                 <w:rFonts w:ascii="Arial" w:hAnsi="Arial" w:cs="Arial"/>
                 <w:sz w:val="18"/>
               </w:rPr>
-              <w:t>Java</w:t>
+              <w:t>C/C#</w:t>
             </w:r>
           </w:p>
           <w:p>
@@ -473,7 +447,7 @@
                 <w:rFonts w:ascii="Arial" w:hAnsi="Arial" w:cs="Arial"/>
                 <w:sz w:val="18"/>
               </w:rPr>
-              <w:t>C/C++</w:t>
+              <w:t>Java</w:t>
             </w:r>
           </w:p>
           <w:p>
@@ -495,7 +469,7 @@
                 <w:rFonts w:ascii="Arial" w:hAnsi="Arial" w:cs="Arial"/>
                 <w:sz w:val="18"/>
               </w:rPr>
-              <w:t>HTML/XML</w:t>
+              <w:t>HTML</w:t>
             </w:r>
           </w:p>
           <w:p>
@@ -517,7 +491,7 @@
                 <w:rFonts w:ascii="Arial" w:hAnsi="Arial" w:cs="Arial"/>
                 <w:sz w:val="18"/>
               </w:rPr>
-              <w:t>Verilog</w:t>
+              <w:t>CSS</w:t>
             </w:r>
           </w:p>
           <w:p>
@@ -539,7 +513,7 @@
                 <w:rFonts w:ascii="Arial" w:hAnsi="Arial" w:cs="Arial"/>
                 <w:sz w:val="18"/>
               </w:rPr>
-              <w:t>Assembly (ARM/x86_64)</w:t>
+              <w:t>JavaScript</w:t>
             </w:r>
           </w:p>
           <w:p>
@@ -561,7 +535,7 @@
                 <w:rFonts w:ascii="Arial" w:hAnsi="Arial" w:cs="Arial"/>
                 <w:sz w:val="18"/>
               </w:rPr>
-              <w:t>MATLAB</w:t>
+              <w:t>SQL</w:t>
             </w:r>
           </w:p>
           <w:p>
@@ -583,7 +557,7 @@
                 <w:rFonts w:ascii="Arial" w:hAnsi="Arial" w:cs="Arial"/>
                 <w:sz w:val="18"/>
               </w:rPr>
-              <w:t>Git</w:t>
+              <w:t>ARM</w:t>
             </w:r>
           </w:p>
           <w:p>
@@ -605,12 +579,13 @@
                 <w:rFonts w:ascii="Arial" w:hAnsi="Arial" w:cs="Arial"/>
                 <w:sz w:val="18"/>
               </w:rPr>
-              <w:t>Microsoft Office</w:t>
+              <w:t>Verilog</w:t>
             </w:r>
           </w:p>
           <w:p>
             <w:pPr>
               <w:spacing w:after="200" w:line="276" w:lineRule="auto"/>
+              <w:ind w:left="144"/>
               <w:contextualSpacing/>
               <w:rPr>
                 <w:rFonts w:ascii="Arial" w:hAnsi="Arial" w:cs="Arial"/>
@@ -642,7 +617,7 @@
                 <w:rFonts w:ascii="Arial" w:hAnsi="Arial" w:cs="Arial"/>
                 <w:sz w:val="18"/>
               </w:rPr>
-              <w:t>Stage Management</w:t>
+              <w:t>Git</w:t>
             </w:r>
           </w:p>
           <w:p>
@@ -664,7 +639,7 @@
                 <w:rFonts w:ascii="Arial" w:hAnsi="Arial" w:cs="Arial"/>
                 <w:sz w:val="18"/>
               </w:rPr>
-              <w:t>Team Leading</w:t>
+              <w:t>Visual Studio / TFS</w:t>
             </w:r>
           </w:p>
           <w:p>
@@ -686,7 +661,7 @@
                 <w:rFonts w:ascii="Arial" w:hAnsi="Arial" w:cs="Arial"/>
                 <w:sz w:val="18"/>
               </w:rPr>
-              <w:t>Public Speaking</w:t>
+              <w:t>ASP.NET (MVC)</w:t>
             </w:r>
           </w:p>
           <w:p>
@@ -708,7 +683,7 @@
                 <w:rFonts w:ascii="Arial" w:hAnsi="Arial" w:cs="Arial"/>
                 <w:sz w:val="18"/>
               </w:rPr>
-              <w:t>Debate Team</w:t>
+              <w:t>Eclipse</w:t>
             </w:r>
           </w:p>
           <w:p>
@@ -730,17 +705,52 @@
                 <w:rFonts w:ascii="Arial" w:hAnsi="Arial" w:cs="Arial"/>
                 <w:sz w:val="18"/>
               </w:rPr>
-              <w:t>Technical Writing</w:t>
+              <w:t>SQL Server Management Studio</w:t>
             </w:r>
           </w:p>
           <w:p>
             <w:pPr>
+              <w:numPr>
+                <w:ilvl w:val="0"/>
+                <w:numId w:val="1"/>
+              </w:numPr>
+              <w:spacing w:after="200" w:line="276" w:lineRule="auto"/>
+              <w:ind w:left="144" w:hanging="144"/>
               <w:contextualSpacing/>
               <w:rPr>
                 <w:rFonts w:ascii="Arial" w:hAnsi="Arial" w:cs="Arial"/>
                 <w:sz w:val="18"/>
               </w:rPr>
             </w:pPr>
+            <w:r>
+              <w:rPr>
+                <w:rFonts w:ascii="Arial" w:hAnsi="Arial" w:cs="Arial"/>
+                <w:sz w:val="18"/>
+              </w:rPr>
+              <w:t>Quartus</w:t>
+            </w:r>
+          </w:p>
+          <w:p>
+            <w:pPr>
+              <w:numPr>
+                <w:ilvl w:val="0"/>
+                <w:numId w:val="1"/>
+              </w:numPr>
+              <w:spacing w:after="200" w:line="276" w:lineRule="auto"/>
+              <w:ind w:left="144" w:hanging="144"/>
+              <w:contextualSpacing/>
+              <w:rPr>
+                <w:rFonts w:ascii="Arial" w:hAnsi="Arial" w:cs="Arial"/>
+                <w:sz w:val="18"/>
+              </w:rPr>
+            </w:pPr>
+            <w:r>
+              <w:rPr>
+                <w:rFonts w:ascii="Arial" w:hAnsi="Arial" w:cs="Arial"/>
+                <w:sz w:val="18"/>
+              </w:rPr>
+              <w:t>Excel</w:t>
+            </w:r>
           </w:p>
         </w:tc>
         <w:tc>
@@ -920,8 +930,10 @@
         <w:spacing w:after="0" w:line="220" w:lineRule="exact"/>
         <w:contextualSpacing/>
         <w:rPr>
-          <w:rFonts w:ascii="Arial Black" w:hAnsi="Arial Black" w:cs="Arial"/>
-          <w:color w:val="9CC2E5" w:themeColor="accent1" w:themeTint="99"/>
+          <w:rFonts w:ascii="Arial" w:hAnsi="Arial" w:cs="Arial"/>
+          <w:b/>
+          <w:color w:val="000000" w:themeColor="text1"/>
+          <w:sz w:val="18"/>
         </w:rPr>
       </w:pPr>
       <w:r>
@@ -935,6 +947,304 @@
           <v:rect id="_x0000_i1026" style="width:0;height:1.5pt" o:hralign="center" o:hrstd="t" o:hr="t" fillcolor="#a0a0a0" stroked="f"/>
         </w:pict>
       </w:r>
+    </w:p>
+    <w:tbl>
+      <w:tblPr>
+        <w:tblStyle w:val="TableGrid"/>
+        <w:tblW w:w="0" w:type="auto"/>
+        <w:tblBorders>
+          <w:top w:val="none" w:sz="0" w:space="0" w:color="auto"/>
+          <w:left w:val="none" w:sz="0" w:space="0" w:color="auto"/>
+          <w:bottom w:val="none" w:sz="0" w:space="0" w:color="auto"/>
+          <w:right w:val="none" w:sz="0" w:space="0" w:color="auto"/>
+          <w:insideH w:val="none" w:sz="0" w:space="0" w:color="auto"/>
+          <w:insideV w:val="none" w:sz="0" w:space="0" w:color="auto"/>
+        </w:tblBorders>
+        <w:tblLook w:val="04A0" w:firstRow="1" w:lastRow="0" w:firstColumn="1" w:lastColumn="0" w:noHBand="0" w:noVBand="1"/>
+      </w:tblPr>
+      <w:tblGrid>
+        <w:gridCol w:w="6056"/>
+        <w:gridCol w:w="3304"/>
+      </w:tblGrid>
+      <w:tr>
+        <w:tc>
+          <w:tcPr>
+            <w:tcW w:w="6204" w:type="dxa"/>
+          </w:tcPr>
+          <w:p>
+            <w:pPr>
+              <w:rPr>
+                <w:rFonts w:ascii="Arial" w:hAnsi="Arial" w:cs="Arial"/>
+                <w:b/>
+                <w:color w:val="000000" w:themeColor="text1"/>
+                <w:sz w:val="20"/>
+              </w:rPr>
+            </w:pPr>
+            <w:r>
+              <w:rPr>
+                <w:rFonts w:ascii="Arial" w:hAnsi="Arial" w:cs="Arial"/>
+                <w:b/>
+                <w:color w:val="000000" w:themeColor="text1"/>
+                <w:sz w:val="20"/>
+              </w:rPr>
+              <w:t>PerfectMind Inc.</w:t>
+            </w:r>
+          </w:p>
+          <w:p>
+            <w:pPr>
+              <w:rPr>
+                <w:rFonts w:ascii="Arial" w:hAnsi="Arial" w:cs="Arial"/>
+                <w:b/>
+                <w:i/>
+                <w:color w:val="000000" w:themeColor="text1"/>
+                <w:sz w:val="18"/>
+              </w:rPr>
+            </w:pPr>
+            <w:r>
+              <w:rPr>
+                <w:rFonts w:ascii="Arial" w:hAnsi="Arial" w:cs="Arial"/>
+                <w:b/>
+                <w:i/>
+                <w:color w:val="000000" w:themeColor="text1"/>
+                <w:sz w:val="18"/>
+              </w:rPr>
+              <w:t>Quality Assurance Tester / Junior Development</w:t>
+            </w:r>
+            <w:r>
+              <w:rPr>
+                <w:rFonts w:ascii="Arial" w:hAnsi="Arial" w:cs="Arial"/>
+                <w:b/>
+                <w:color w:val="000000" w:themeColor="text1"/>
+                <w:sz w:val="18"/>
+              </w:rPr>
+              <w:tab/>
+            </w:r>
+            <w:r>
+              <w:rPr>
+                <w:rFonts w:ascii="Arial" w:hAnsi="Arial" w:cs="Arial"/>
+                <w:b/>
+                <w:color w:val="000000" w:themeColor="text1"/>
+                <w:sz w:val="18"/>
+              </w:rPr>
+              <w:tab/>
+            </w:r>
+            <w:r>
+              <w:rPr>
+                <w:rFonts w:ascii="Arial" w:hAnsi="Arial" w:cs="Arial"/>
+                <w:b/>
+                <w:color w:val="000000" w:themeColor="text1"/>
+                <w:sz w:val="18"/>
+              </w:rPr>
+              <w:tab/>
+            </w:r>
+          </w:p>
+        </w:tc>
+        <w:tc>
+          <w:tcPr>
+            <w:tcW w:w="3372" w:type="dxa"/>
+          </w:tcPr>
+          <w:p>
+            <w:pPr>
+              <w:jc w:val="right"/>
+              <w:rPr>
+                <w:rFonts w:ascii="Arial" w:hAnsi="Arial" w:cs="Arial"/>
+                <w:b/>
+                <w:color w:val="000000" w:themeColor="text1"/>
+                <w:sz w:val="18"/>
+              </w:rPr>
+            </w:pPr>
+            <w:r>
+              <w:rPr>
+                <w:rFonts w:ascii="Arial" w:hAnsi="Arial" w:cs="Arial"/>
+                <w:b/>
+                <w:color w:val="000000" w:themeColor="text1"/>
+                <w:sz w:val="18"/>
+              </w:rPr>
+              <w:t>May, 2017</w:t>
+            </w:r>
+            <w:r>
+              <w:rPr>
+                <w:rFonts w:ascii="Arial" w:hAnsi="Arial" w:cs="Arial"/>
+                <w:b/>
+                <w:color w:val="000000" w:themeColor="text1"/>
+                <w:sz w:val="18"/>
+              </w:rPr>
+              <w:t xml:space="preserve"> – </w:t>
+            </w:r>
+            <w:r>
+              <w:rPr>
+                <w:rFonts w:ascii="Arial" w:hAnsi="Arial" w:cs="Arial"/>
+                <w:b/>
+                <w:color w:val="000000" w:themeColor="text1"/>
+                <w:sz w:val="18"/>
+              </w:rPr>
+              <w:t>December, 2017</w:t>
+            </w:r>
+          </w:p>
+        </w:tc>
+      </w:tr>
+    </w:tbl>
+    <w:p>
+      <w:pPr>
+        <w:pStyle w:val="ListParagraph"/>
+        <w:numPr>
+          <w:ilvl w:val="0"/>
+          <w:numId w:val="3"/>
+        </w:numPr>
+        <w:spacing w:after="0" w:line="240" w:lineRule="auto"/>
+        <w:ind w:left="144" w:hanging="144"/>
+        <w:rPr>
+          <w:rFonts w:ascii="Arial" w:hAnsi="Arial" w:cs="Arial"/>
+          <w:color w:val="000000" w:themeColor="text1"/>
+          <w:sz w:val="18"/>
+          <w:szCs w:val="18"/>
+        </w:rPr>
+      </w:pPr>
+      <w:r>
+        <w:rPr>
+          <w:rFonts w:ascii="Arial" w:hAnsi="Arial" w:cs="Arial"/>
+          <w:color w:val="000000" w:themeColor="text1"/>
+          <w:sz w:val="18"/>
+          <w:szCs w:val="18"/>
+        </w:rPr>
+        <w:t>Quality Assurance</w:t>
+      </w:r>
+      <w:r>
+        <w:rPr>
+          <w:rFonts w:ascii="Arial" w:hAnsi="Arial" w:cs="Arial"/>
+          <w:color w:val="000000" w:themeColor="text1"/>
+          <w:sz w:val="18"/>
+          <w:szCs w:val="18"/>
+        </w:rPr>
+        <w:t>.</w:t>
+      </w:r>
+    </w:p>
+    <w:p>
+      <w:pPr>
+        <w:pStyle w:val="ListParagraph"/>
+        <w:numPr>
+          <w:ilvl w:val="0"/>
+          <w:numId w:val="3"/>
+        </w:numPr>
+        <w:spacing w:after="0" w:line="240" w:lineRule="auto"/>
+        <w:ind w:left="144" w:hanging="144"/>
+        <w:rPr>
+          <w:rFonts w:ascii="Arial" w:hAnsi="Arial" w:cs="Arial"/>
+          <w:color w:val="000000" w:themeColor="text1"/>
+          <w:sz w:val="18"/>
+          <w:szCs w:val="18"/>
+        </w:rPr>
+      </w:pPr>
+      <w:r>
+        <w:rPr>
+          <w:rFonts w:ascii="Arial" w:hAnsi="Arial" w:cs="Arial"/>
+          <w:color w:val="000000" w:themeColor="text1"/>
+          <w:sz w:val="18"/>
+          <w:szCs w:val="18"/>
+        </w:rPr>
+        <w:t>Data Analysis</w:t>
+      </w:r>
+      <w:r>
+        <w:rPr>
+          <w:rFonts w:ascii="Arial" w:hAnsi="Arial" w:cs="Arial"/>
+          <w:color w:val="000000" w:themeColor="text1"/>
+          <w:sz w:val="18"/>
+          <w:szCs w:val="18"/>
+        </w:rPr>
+        <w:t>.</w:t>
+      </w:r>
+    </w:p>
+    <w:p>
+      <w:pPr>
+        <w:pStyle w:val="ListParagraph"/>
+        <w:numPr>
+          <w:ilvl w:val="0"/>
+          <w:numId w:val="3"/>
+        </w:numPr>
+        <w:spacing w:after="0" w:line="240" w:lineRule="auto"/>
+        <w:ind w:left="144" w:hanging="144"/>
+        <w:rPr>
+          <w:rFonts w:ascii="Arial" w:hAnsi="Arial" w:cs="Arial"/>
+          <w:color w:val="000000" w:themeColor="text1"/>
+          <w:sz w:val="18"/>
+          <w:szCs w:val="18"/>
+        </w:rPr>
+      </w:pPr>
+      <w:r>
+        <w:rPr>
+          <w:rFonts w:ascii="Arial" w:hAnsi="Arial" w:cs="Arial"/>
+          <w:color w:val="000000" w:themeColor="text1"/>
+          <w:sz w:val="18"/>
+          <w:szCs w:val="18"/>
+        </w:rPr>
+        <w:t>Automation</w:t>
+      </w:r>
+      <w:r>
+        <w:rPr>
+          <w:rFonts w:ascii="Arial" w:hAnsi="Arial" w:cs="Arial"/>
+          <w:color w:val="000000" w:themeColor="text1"/>
+          <w:sz w:val="18"/>
+          <w:szCs w:val="18"/>
+        </w:rPr>
+        <w:t>.</w:t>
+      </w:r>
+    </w:p>
+    <w:p>
+      <w:pPr>
+        <w:pStyle w:val="ListParagraph"/>
+        <w:numPr>
+          <w:ilvl w:val="0"/>
+          <w:numId w:val="3"/>
+        </w:numPr>
+        <w:spacing w:after="0" w:line="240" w:lineRule="auto"/>
+        <w:ind w:left="144" w:hanging="144"/>
+        <w:rPr>
+          <w:rFonts w:ascii="Arial" w:hAnsi="Arial" w:cs="Arial"/>
+          <w:color w:val="000000" w:themeColor="text1"/>
+          <w:sz w:val="18"/>
+          <w:szCs w:val="18"/>
+        </w:rPr>
+      </w:pPr>
+      <w:r>
+        <w:rPr>
+          <w:rFonts w:ascii="Arial" w:hAnsi="Arial" w:cs="Arial"/>
+          <w:color w:val="000000" w:themeColor="text1"/>
+          <w:sz w:val="18"/>
+          <w:szCs w:val="18"/>
+        </w:rPr>
+        <w:t>Software Development</w:t>
+      </w:r>
+      <w:r>
+        <w:rPr>
+          <w:rFonts w:ascii="Arial" w:hAnsi="Arial" w:cs="Arial"/>
+          <w:color w:val="000000" w:themeColor="text1"/>
+          <w:sz w:val="18"/>
+          <w:szCs w:val="18"/>
+        </w:rPr>
+        <w:t>.</w:t>
+      </w:r>
+    </w:p>
+    <w:p>
+      <w:pPr>
+        <w:spacing w:after="0" w:line="220" w:lineRule="exact"/>
+        <w:contextualSpacing/>
+        <w:rPr>
+          <w:rFonts w:ascii="Arial" w:hAnsi="Arial" w:cs="Arial"/>
+          <w:b/>
+          <w:color w:val="000000" w:themeColor="text1"/>
+          <w:sz w:val="18"/>
+        </w:rPr>
+      </w:pPr>
+    </w:p>
+    <w:p>
+      <w:pPr>
+        <w:spacing w:after="0" w:line="220" w:lineRule="exact"/>
+        <w:contextualSpacing/>
+        <w:rPr>
+          <w:rFonts w:ascii="Arial Black" w:hAnsi="Arial Black" w:cs="Arial"/>
+          <w:color w:val="9CC2E5" w:themeColor="accent1" w:themeTint="99"/>
+        </w:rPr>
+      </w:pPr>
     </w:p>
     <w:tbl>
       <w:tblPr>
@@ -1209,7 +1519,18 @@
           <w:sz w:val="18"/>
           <w:szCs w:val="18"/>
         </w:rPr>
-        <w:t>Trained and proficient in the use of many technical tools including wire trimmers, plyers, screwdrivers, X-ACTO knives, and electrical tape.</w:t>
+        <w:t>Trained and proficient in the use of many technical tools including wire trimmers, plyers,</w:t>
+      </w:r>
+      <w:bookmarkStart w:id="0" w:name="_GoBack"/>
+      <w:bookmarkEnd w:id="0"/>
+      <w:r>
+        <w:rPr>
+          <w:rFonts w:ascii="Arial" w:hAnsi="Arial" w:cs="Arial"/>
+          <w:color w:val="000000" w:themeColor="text1"/>
+          <w:sz w:val="18"/>
+          <w:szCs w:val="18"/>
+        </w:rPr>
+        <w:t xml:space="preserve"> screwdrivers, X-ACTO knives, and electrical tape.</w:t>
       </w:r>
     </w:p>
     <w:p>
@@ -1253,8 +1574,10 @@
         <w:spacing w:after="0" w:line="220" w:lineRule="exact"/>
         <w:contextualSpacing/>
         <w:rPr>
-          <w:rFonts w:ascii="Arial Black" w:hAnsi="Arial Black" w:cs="Arial"/>
-          <w:color w:val="9CC2E5" w:themeColor="accent1" w:themeTint="99"/>
+          <w:rFonts w:ascii="Arial" w:hAnsi="Arial" w:cs="Arial"/>
+          <w:b/>
+          <w:color w:val="000000" w:themeColor="text1"/>
+          <w:sz w:val="18"/>
         </w:rPr>
       </w:pPr>
       <w:r>
@@ -1268,6 +1591,139 @@
           <v:rect id="_x0000_i1027" style="width:0;height:1.5pt" o:hralign="center" o:hrstd="t" o:hr="t" fillcolor="#a0a0a0" stroked="f"/>
         </w:pict>
       </w:r>
+    </w:p>
+    <w:tbl>
+      <w:tblPr>
+        <w:tblStyle w:val="TableGrid"/>
+        <w:tblW w:w="0" w:type="auto"/>
+        <w:tblBorders>
+          <w:top w:val="none" w:sz="0" w:space="0" w:color="auto"/>
+          <w:left w:val="none" w:sz="0" w:space="0" w:color="auto"/>
+          <w:bottom w:val="none" w:sz="0" w:space="0" w:color="auto"/>
+          <w:right w:val="none" w:sz="0" w:space="0" w:color="auto"/>
+          <w:insideH w:val="none" w:sz="0" w:space="0" w:color="auto"/>
+          <w:insideV w:val="none" w:sz="0" w:space="0" w:color="auto"/>
+        </w:tblBorders>
+        <w:tblLook w:val="04A0" w:firstRow="1" w:lastRow="0" w:firstColumn="1" w:lastColumn="0" w:noHBand="0" w:noVBand="1"/>
+      </w:tblPr>
+      <w:tblGrid>
+        <w:gridCol w:w="6057"/>
+        <w:gridCol w:w="3303"/>
+      </w:tblGrid>
+      <w:tr>
+        <w:tc>
+          <w:tcPr>
+            <w:tcW w:w="6204" w:type="dxa"/>
+          </w:tcPr>
+          <w:p>
+            <w:pPr>
+              <w:rPr>
+                <w:rFonts w:ascii="Arial" w:hAnsi="Arial" w:cs="Arial"/>
+                <w:b/>
+                <w:color w:val="000000" w:themeColor="text1"/>
+                <w:sz w:val="20"/>
+              </w:rPr>
+            </w:pPr>
+            <w:r>
+              <w:rPr>
+                <w:rFonts w:ascii="Arial" w:hAnsi="Arial" w:cs="Arial"/>
+                <w:b/>
+                <w:color w:val="000000" w:themeColor="text1"/>
+                <w:sz w:val="20"/>
+              </w:rPr>
+              <w:t>Personal Website</w:t>
+            </w:r>
+            <w:r>
+              <w:rPr>
+                <w:rFonts w:ascii="Arial" w:hAnsi="Arial" w:cs="Arial"/>
+                <w:b/>
+                <w:color w:val="000000" w:themeColor="text1"/>
+                <w:sz w:val="18"/>
+              </w:rPr>
+              <w:tab/>
+            </w:r>
+            <w:r>
+              <w:rPr>
+                <w:rFonts w:ascii="Arial" w:hAnsi="Arial" w:cs="Arial"/>
+                <w:b/>
+                <w:color w:val="000000" w:themeColor="text1"/>
+                <w:sz w:val="18"/>
+              </w:rPr>
+              <w:tab/>
+            </w:r>
+          </w:p>
+        </w:tc>
+        <w:tc>
+          <w:tcPr>
+            <w:tcW w:w="3372" w:type="dxa"/>
+          </w:tcPr>
+          <w:p>
+            <w:pPr>
+              <w:jc w:val="right"/>
+              <w:rPr>
+                <w:rFonts w:ascii="Arial" w:hAnsi="Arial" w:cs="Arial"/>
+                <w:b/>
+                <w:color w:val="000000" w:themeColor="text1"/>
+                <w:sz w:val="18"/>
+              </w:rPr>
+            </w:pPr>
+            <w:r>
+              <w:rPr>
+                <w:rFonts w:ascii="Arial" w:hAnsi="Arial" w:cs="Arial"/>
+                <w:b/>
+                <w:color w:val="000000" w:themeColor="text1"/>
+                <w:sz w:val="18"/>
+              </w:rPr>
+              <w:t>October</w:t>
+            </w:r>
+            <w:r>
+              <w:rPr>
+                <w:rFonts w:ascii="Arial" w:hAnsi="Arial" w:cs="Arial"/>
+                <w:b/>
+                <w:color w:val="000000" w:themeColor="text1"/>
+                <w:sz w:val="18"/>
+              </w:rPr>
+              <w:t>, 2017</w:t>
+            </w:r>
+          </w:p>
+        </w:tc>
+      </w:tr>
+    </w:tbl>
+    <w:p>
+      <w:pPr>
+        <w:pStyle w:val="ListParagraph"/>
+        <w:numPr>
+          <w:ilvl w:val="0"/>
+          <w:numId w:val="3"/>
+        </w:numPr>
+        <w:spacing w:after="0" w:line="220" w:lineRule="exact"/>
+        <w:ind w:left="144" w:hanging="144"/>
+        <w:rPr>
+          <w:rFonts w:ascii="Arial" w:hAnsi="Arial" w:cs="Arial"/>
+          <w:b/>
+          <w:color w:val="000000" w:themeColor="text1"/>
+          <w:sz w:val="18"/>
+        </w:rPr>
+      </w:pPr>
+      <w:r>
+        <w:rPr>
+          <w:rFonts w:ascii="Arial" w:hAnsi="Arial" w:cs="Arial"/>
+          <w:color w:val="000000" w:themeColor="text1"/>
+          <w:sz w:val="18"/>
+          <w:szCs w:val="18"/>
+        </w:rPr>
+        <w:t>Website</w:t>
+      </w:r>
+    </w:p>
+    <w:p>
+      <w:pPr>
+        <w:spacing w:after="0" w:line="220" w:lineRule="exact"/>
+        <w:contextualSpacing/>
+        <w:rPr>
+          <w:rFonts w:ascii="Arial Black" w:hAnsi="Arial Black" w:cs="Arial"/>
+          <w:color w:val="9CC2E5" w:themeColor="accent1" w:themeTint="99"/>
+        </w:rPr>
+      </w:pPr>
     </w:p>
     <w:tbl>
       <w:tblPr>
@@ -1632,6 +2088,7 @@
           <w:sz w:val="18"/>
           <w:szCs w:val="18"/>
         </w:rPr>
+        <w:lastRenderedPageBreak/>
         <w:t>Connected the scales to an Arduino, which communicated with a Raspberry Pi 3 and used Wi-Fi to send the data to the app and a connected web server.</w:t>
       </w:r>
     </w:p>
@@ -1988,7 +2445,6 @@
           <w:sz w:val="18"/>
           <w:szCs w:val="18"/>
         </w:rPr>
-        <w:lastRenderedPageBreak/>
         <w:t>Operated the machine and displayed results on a DE1-SOC.</w:t>
       </w:r>
     </w:p>
@@ -3271,6 +3727,7 @@
           <w:color w:val="000000" w:themeColor="text1"/>
           <w:sz w:val="18"/>
         </w:rPr>
+        <w:lastRenderedPageBreak/>
         <w:pict>
           <v:rect id="_x0000_i1032" style="width:0;height:1.5pt" o:hralign="center" o:hrstd="t" o:hr="t" fillcolor="#a0a0a0" stroked="f"/>
         </w:pict>
@@ -4670,6 +5127,7 @@
   <w:rsids>
     <w:rsidRoot w:val="00FD63FD"/>
     <w:rsid w:val="002C3836"/>
+    <w:rsid w:val="00B30332"/>
     <w:rsid w:val="00B7496C"/>
     <w:rsid w:val="00CE4F18"/>
     <w:rsid w:val="00FD63FD"/>

</xml_diff>